<commit_message>
Se añade url del repo
</commit_message>
<xml_diff>
--- a/ej_modulo2/Informe_UML.docx
+++ b/ej_modulo2/Informe_UML.docx
@@ -2778,7 +2778,6 @@
     </w:p>
     <w:p>
       <w:pPr>
-        <w:jc w:val="both"/>
         <w:rPr>
           <w:b/>
           <w:bCs/>
@@ -2794,6 +2793,36 @@
     </w:p>
     <w:p>
       <w:pPr>
+        <w:rPr>
+          <w:b/>
+          <w:bCs/>
+        </w:rPr>
+      </w:pPr>
+    </w:p>
+    <w:p>
+      <w:pPr>
+        <w:rPr>
+          <w:b/>
+          <w:bCs/>
+        </w:rPr>
+      </w:pPr>
+      <w:r>
+        <w:rPr>
+          <w:b/>
+          <w:bCs/>
+        </w:rPr>
+        <w:t xml:space="preserve">  </w:t>
+      </w:r>
+      <w:r>
+        <w:rPr>
+          <w:b/>
+          <w:bCs/>
+        </w:rPr>
+        <w:t>https://github.com/pupoxdev/devsenior-python/tree/main/ej_modulo2</w:t>
+      </w:r>
+    </w:p>
+    <w:p>
+      <w:pPr>
         <w:jc w:val="both"/>
         <w:rPr>
           <w:b/>
@@ -2873,14 +2902,7 @@
           <w:b/>
           <w:bCs/>
         </w:rPr>
-        <w:t xml:space="preserve">Iván Eliecer Beltrán </w:t>
-      </w:r>
-      <w:r>
-        <w:rPr>
-          <w:b/>
-          <w:bCs/>
-        </w:rPr>
-        <w:t>González</w:t>
+        <w:t>Iván Eliecer Beltrán González</w:t>
       </w:r>
       <w:r>
         <w:rPr>
@@ -7312,6 +7334,7 @@
   <w:style w:type="character" w:default="1" w:styleId="Fuentedeprrafopredeter">
     <w:name w:val="Default Paragraph Font"/>
     <w:uiPriority w:val="1"/>
+    <w:semiHidden/>
     <w:unhideWhenUsed/>
   </w:style>
   <w:style w:type="table" w:default="1" w:styleId="Tablanormal">

</xml_diff>